<commit_message>
vault backup: 2026-09-15 23:32:42
</commit_message>
<xml_diff>
--- a/output/20260916歴代誌第一9-35-10-14 「主に尋ねなかった」（早天10分）.docx
+++ b/output/20260916歴代誌第一9-35-10-14 「主に尋ねなかった」（早天10分）.docx
@@ -1664,54 +1664,6 @@
           <w:rFonts w:ascii="Meiryo UI" w:hAnsi="Meiryo UI"/>
           <w:sz w:val="21"/>
         </w:rPr>
-        <w:t xml:space="preserve">答えが返ってこないと感じる時間は、私にもあります。</w:t>
-      </w:r>
-    </w:p>
-    <w:p>
-      <w:pPr>
-        <w:pStyle w:val="a8"/>
-        <w:rPr>
-          <w:rFonts w:ascii="Meiryo UI" w:hAnsi="Meiryo UI"/>
-          <w:sz w:val="21"/>
-        </w:rPr>
-      </w:pPr>
-      <w:r>
-        <w:rPr>
-          <w:rFonts w:ascii="Meiryo UI" w:hAnsi="Meiryo UI"/>
-          <w:sz w:val="21"/>
-        </w:rPr>
-        <w:t xml:space="preserve">そのときに、どこへ先に足が向くのか。</w:t>
-      </w:r>
-    </w:p>
-    <w:p>
-      <w:pPr>
-        <w:pStyle w:val="a8"/>
-        <w:rPr>
-          <w:rFonts w:ascii="Meiryo UI" w:hAnsi="Meiryo UI"/>
-          <w:sz w:val="21"/>
-        </w:rPr>
-      </w:pPr>
-      <w:r>
-        <w:rPr>
-          <w:rFonts w:ascii="Meiryo UI" w:hAnsi="Meiryo UI"/>
-          <w:sz w:val="21"/>
-        </w:rPr>
-        <w:t xml:space="preserve">サウルの場合は、そこで霊媒のほうへ行きました。</w:t>
-      </w:r>
-    </w:p>
-    <w:p>
-      <w:pPr>
-        <w:pStyle w:val="a8"/>
-        <w:rPr>
-          <w:rFonts w:ascii="Meiryo UI" w:hAnsi="Meiryo UI"/>
-          <w:sz w:val="21"/>
-        </w:rPr>
-      </w:pPr>
-      <w:r>
-        <w:rPr>
-          <w:rFonts w:ascii="Meiryo UI" w:hAnsi="Meiryo UI"/>
-          <w:sz w:val="21"/>
-        </w:rPr>
         <w:t xml:space="preserve">もう一つあります。</w:t>
       </w:r>
     </w:p>
@@ -2041,7 +1993,7 @@
           <w:rFonts w:ascii="Meiryo UI" w:hAnsi="Meiryo UI"/>
           <w:sz w:val="21"/>
         </w:rPr>
-        <w:t xml:space="preserve">〔七　結び　1分〕</w:t>
+        <w:t xml:space="preserve">〔七　適用と結び　1分30秒〕</w:t>
       </w:r>
     </w:p>
     <w:p>
@@ -2082,6 +2034,22 @@
           <w:rFonts w:ascii="Meiryo UI" w:hAnsi="Meiryo UI"/>
           <w:sz w:val="21"/>
         </w:rPr>
+        <w:t xml:space="preserve">九章の終わりまで、一つも省かれていません。</w:t>
+      </w:r>
+    </w:p>
+    <w:p>
+      <w:pPr>
+        <w:pStyle w:val="a8"/>
+        <w:rPr>
+          <w:rFonts w:ascii="Meiryo UI" w:hAnsi="Meiryo UI"/>
+          <w:sz w:val="21"/>
+        </w:rPr>
+      </w:pPr>
+      <w:r>
+        <w:rPr>
+          <w:rFonts w:ascii="Meiryo UI" w:hAnsi="Meiryo UI"/>
+          <w:sz w:val="21"/>
+        </w:rPr>
         <w:t xml:space="preserve">けれども、その名前の列の最後に置かれたのは、</w:t>
       </w:r>
     </w:p>
@@ -2109,173 +2077,248 @@
           <w:sz w:val="21"/>
         </w:rPr>
       </w:pPr>
-      <w:r>
-        <w:rPr>
-          <w:rFonts w:ascii="Meiryo UI" w:hAnsi="Meiryo UI"/>
-          <w:sz w:val="21"/>
-        </w:rPr>
-        <w:t xml:space="preserve">私にも、記録に残るものがあります。</w:t>
-      </w:r>
-    </w:p>
-    <w:p>
-      <w:pPr>
-        <w:pStyle w:val="a8"/>
-        <w:rPr>
-          <w:rFonts w:ascii="Meiryo UI" w:hAnsi="Meiryo UI"/>
-          <w:sz w:val="21"/>
-        </w:rPr>
-      </w:pPr>
-      <w:r>
-        <w:rPr>
-          <w:rFonts w:ascii="Meiryo UI" w:hAnsi="Meiryo UI"/>
-          <w:sz w:val="21"/>
-        </w:rPr>
-        <w:t xml:space="preserve">やってきたこと、書いたもの、続けてきたこと。</w:t>
-      </w:r>
-    </w:p>
-    <w:p>
-      <w:pPr>
-        <w:pStyle w:val="a8"/>
-        <w:rPr>
-          <w:rFonts w:ascii="Meiryo UI" w:hAnsi="Meiryo UI"/>
-          <w:sz w:val="21"/>
-        </w:rPr>
-      </w:pPr>
-      <w:r>
-        <w:rPr>
-          <w:rFonts w:ascii="Meiryo UI" w:hAnsi="Meiryo UI"/>
-          <w:sz w:val="21"/>
-        </w:rPr>
-        <w:t xml:space="preserve">それは残ります。</w:t>
-      </w:r>
-    </w:p>
-    <w:p>
-      <w:pPr>
-        <w:pStyle w:val="a8"/>
-        <w:rPr>
-          <w:rFonts w:ascii="Meiryo UI" w:hAnsi="Meiryo UI"/>
-          <w:sz w:val="21"/>
-        </w:rPr>
-      </w:pPr>
-      <w:r>
-        <w:rPr>
-          <w:rFonts w:ascii="Meiryo UI" w:hAnsi="Meiryo UI"/>
-          <w:sz w:val="21"/>
-        </w:rPr>
-        <w:t xml:space="preserve">けれども、その記録の最後に何が書かれるかは、それとは別のことでした。</w:t>
-      </w:r>
-    </w:p>
-    <w:p>
-      <w:pPr>
-        <w:pStyle w:val="a8"/>
-        <w:rPr>
-          <w:rFonts w:ascii="Meiryo UI" w:hAnsi="Meiryo UI"/>
-          <w:sz w:val="21"/>
-        </w:rPr>
-      </w:pPr>
-      <w:r>
-        <w:rPr>
-          <w:rFonts w:ascii="Meiryo UI" w:hAnsi="Meiryo UI"/>
-          <w:sz w:val="21"/>
-        </w:rPr>
-        <w:t xml:space="preserve">けれども、今日進めようとしている一件について、私はまだ主に尋ねていないかもしれません。</w:t>
-      </w:r>
-    </w:p>
-    <w:p>
-      <w:pPr>
-        <w:pStyle w:val="a8"/>
-        <w:rPr>
-          <w:rFonts w:ascii="Meiryo UI" w:hAnsi="Meiryo UI"/>
-          <w:sz w:val="21"/>
-        </w:rPr>
-      </w:pPr>
-      <w:r>
-        <w:rPr>
-          <w:rFonts w:ascii="Meiryo UI" w:hAnsi="Meiryo UI"/>
-          <w:sz w:val="21"/>
-        </w:rPr>
-        <w:t xml:space="preserve">もう動き出しているからこそ、聞かないまま先へ行ってしまうのではないでしょうか。</w:t>
-      </w:r>
-    </w:p>
-    <w:p>
-      <w:pPr>
-        <w:pStyle w:val="a8"/>
-        <w:rPr>
-          <w:rFonts w:ascii="Meiryo UI" w:hAnsi="Meiryo UI"/>
-          <w:sz w:val="21"/>
-        </w:rPr>
-      </w:pPr>
-      <w:r>
-        <w:rPr>
-          <w:rFonts w:ascii="Meiryo UI" w:hAnsi="Meiryo UI"/>
-          <w:sz w:val="21"/>
-        </w:rPr>
-        <w:t xml:space="preserve">動き始めた後で立ち止まるのは、面倒なことです。</w:t>
-      </w:r>
-    </w:p>
-    <w:p>
-      <w:pPr>
-        <w:pStyle w:val="a8"/>
-        <w:rPr>
-          <w:rFonts w:ascii="Meiryo UI" w:hAnsi="Meiryo UI"/>
-          <w:sz w:val="21"/>
-        </w:rPr>
-      </w:pPr>
-      <w:r>
-        <w:rPr>
-          <w:rFonts w:ascii="Meiryo UI" w:hAnsi="Meiryo UI"/>
-          <w:sz w:val="21"/>
-        </w:rPr>
-        <w:t xml:space="preserve">それでも、今日はそこで一度止まりたいと思います。</w:t>
-      </w:r>
-    </w:p>
-    <w:p>
-      <w:pPr>
-        <w:pStyle w:val="a8"/>
-        <w:rPr>
-          <w:rFonts w:ascii="Meiryo UI" w:hAnsi="Meiryo UI"/>
-          <w:sz w:val="21"/>
-        </w:rPr>
-      </w:pPr>
-      <w:r>
-        <w:rPr>
-          <w:rFonts w:ascii="Meiryo UI" w:hAnsi="Meiryo UI"/>
-          <w:sz w:val="21"/>
-        </w:rPr>
-        <w:t xml:space="preserve">今朝、一つだけ選びたいと思います。</w:t>
-      </w:r>
-    </w:p>
-    <w:p>
-      <w:pPr>
-        <w:pStyle w:val="a8"/>
-        <w:rPr>
-          <w:rFonts w:ascii="Meiryo UI" w:hAnsi="Meiryo UI"/>
-          <w:sz w:val="21"/>
-        </w:rPr>
-      </w:pPr>
-      <w:r>
-        <w:rPr>
-          <w:rFonts w:ascii="Meiryo UI" w:hAnsi="Meiryo UI"/>
-          <w:sz w:val="21"/>
-        </w:rPr>
-        <w:t xml:space="preserve">今日進める用件を一つ思い浮かべて、その一件を、</w:t>
-      </w:r>
-    </w:p>
-    <w:p>
-      <w:pPr>
-        <w:pStyle w:val="a8"/>
-        <w:rPr>
-          <w:rFonts w:ascii="Meiryo UI" w:hAnsi="Meiryo UI"/>
-          <w:sz w:val="21"/>
-        </w:rPr>
-      </w:pPr>
-      <w:r>
-        <w:rPr>
-          <w:rFonts w:ascii="Meiryo UI" w:hAnsi="Meiryo UI"/>
-          <w:sz w:val="21"/>
-        </w:rPr>
-        <w:t xml:space="preserve">まず主の前に置いてから動き出したいと思います。</w:t>
-      </w:r>
+    </w:p>
+    <w:p>
+      <w:pPr>
+        <w:pStyle w:val="a8"/>
+        <w:rPr>
+          <w:rFonts w:ascii="Meiryo UI" w:hAnsi="Meiryo UI"/>
+          <w:sz w:val="21"/>
+        </w:rPr>
+      </w:pPr>
+      <w:r>
+        <w:rPr>
+          <w:rFonts w:ascii="Meiryo UI" w:hAnsi="Meiryo UI"/>
+          <w:sz w:val="21"/>
+        </w:rPr>
+        <w:t xml:space="preserve">サウルは、主のことばを知らなかった人ではありません。</w:t>
+      </w:r>
+    </w:p>
+    <w:p>
+      <w:pPr>
+        <w:pStyle w:val="a8"/>
+        <w:rPr>
+          <w:rFonts w:ascii="Meiryo UI" w:hAnsi="Meiryo UI"/>
+          <w:sz w:val="21"/>
+        </w:rPr>
+      </w:pPr>
+      <w:r>
+        <w:rPr>
+          <w:rFonts w:ascii="Meiryo UI" w:hAnsi="Meiryo UI"/>
+          <w:sz w:val="21"/>
+        </w:rPr>
+        <w:t xml:space="preserve">自分の国から霊媒を追い出したこともある人です。</w:t>
+      </w:r>
+    </w:p>
+    <w:p>
+      <w:pPr>
+        <w:pStyle w:val="a8"/>
+        <w:rPr>
+          <w:rFonts w:ascii="Meiryo UI" w:hAnsi="Meiryo UI"/>
+          <w:sz w:val="21"/>
+        </w:rPr>
+      </w:pPr>
+      <w:r>
+        <w:rPr>
+          <w:rFonts w:ascii="Meiryo UI" w:hAnsi="Meiryo UI"/>
+          <w:sz w:val="21"/>
+        </w:rPr>
+        <w:t xml:space="preserve">知っていて、答えが見えなくなったときに、別の口のほうへ行きました。</w:t>
+      </w:r>
+    </w:p>
+    <w:p>
+      <w:pPr>
+        <w:pStyle w:val="a8"/>
+        <w:rPr>
+          <w:rFonts w:ascii="Meiryo UI" w:hAnsi="Meiryo UI"/>
+          <w:sz w:val="21"/>
+        </w:rPr>
+      </w:pPr>
+      <w:r>
+        <w:rPr>
+          <w:rFonts w:ascii="Meiryo UI" w:hAnsi="Meiryo UI"/>
+          <w:sz w:val="21"/>
+        </w:rPr>
+        <w:t xml:space="preserve">皆さんにも、今日これから動かす一件があると思います。</w:t>
+      </w:r>
+    </w:p>
+    <w:p>
+      <w:pPr>
+        <w:pStyle w:val="a8"/>
+        <w:rPr>
+          <w:rFonts w:ascii="Meiryo UI" w:hAnsi="Meiryo UI"/>
+          <w:sz w:val="21"/>
+        </w:rPr>
+      </w:pPr>
+      <w:r>
+        <w:rPr>
+          <w:rFonts w:ascii="Meiryo UI" w:hAnsi="Meiryo UI"/>
+          <w:sz w:val="21"/>
+        </w:rPr>
+        <w:t xml:space="preserve">仕事のこと、家族のこと、返事を待たせていること。</w:t>
+      </w:r>
+    </w:p>
+    <w:p>
+      <w:pPr>
+        <w:pStyle w:val="a8"/>
+        <w:rPr>
+          <w:rFonts w:ascii="Meiryo UI" w:hAnsi="Meiryo UI"/>
+          <w:sz w:val="21"/>
+        </w:rPr>
+      </w:pPr>
+      <w:r>
+        <w:rPr>
+          <w:rFonts w:ascii="Meiryo UI" w:hAnsi="Meiryo UI"/>
+          <w:sz w:val="21"/>
+        </w:rPr>
+        <w:t xml:space="preserve">その中に、もう決めてしまって、あとは進めるだけになっているものはないでしょうか。</w:t>
+      </w:r>
+    </w:p>
+    <w:p>
+      <w:pPr>
+        <w:pStyle w:val="a8"/>
+        <w:rPr>
+          <w:rFonts w:ascii="Meiryo UI" w:hAnsi="Meiryo UI"/>
+          <w:sz w:val="21"/>
+        </w:rPr>
+      </w:pPr>
+      <w:r>
+        <w:rPr>
+          <w:rFonts w:ascii="Meiryo UI" w:hAnsi="Meiryo UI"/>
+          <w:sz w:val="21"/>
+        </w:rPr>
+        <w:t xml:space="preserve">今日、その一件を、動かす前に主の前に置いてみてください。</w:t>
+      </w:r>
+    </w:p>
+    <w:p>
+      <w:pPr>
+        <w:pStyle w:val="a8"/>
+        <w:rPr>
+          <w:rFonts w:ascii="Meiryo UI" w:hAnsi="Meiryo UI"/>
+          <w:sz w:val="21"/>
+        </w:rPr>
+      </w:pPr>
+      <w:r>
+        <w:rPr>
+          <w:rFonts w:ascii="Meiryo UI" w:hAnsi="Meiryo UI"/>
+          <w:sz w:val="21"/>
+        </w:rPr>
+        <w:t xml:space="preserve">ヤコブの手紙は、知恵に欠けているなら神に求めなさいと言いました。</w:t>
+      </w:r>
+    </w:p>
+    <w:p>
+      <w:pPr>
+        <w:pStyle w:val="a8"/>
+        <w:rPr>
+          <w:rFonts w:ascii="Meiryo UI" w:hAnsi="Meiryo UI"/>
+          <w:sz w:val="21"/>
+        </w:rPr>
+      </w:pPr>
+      <w:r>
+        <w:rPr>
+          <w:rFonts w:ascii="Meiryo UI" w:hAnsi="Meiryo UI"/>
+          <w:sz w:val="21"/>
+        </w:rPr>
+        <w:t xml:space="preserve">とがめることなく与えてくださる方だと書かれています。</w:t>
+      </w:r>
+    </w:p>
+    <w:p>
+      <w:pPr>
+        <w:pStyle w:val="a8"/>
+        <w:rPr>
+          <w:rFonts w:ascii="Meiryo UI" w:hAnsi="Meiryo UI"/>
+          <w:sz w:val="21"/>
+        </w:rPr>
+      </w:pPr>
+      <w:r>
+        <w:rPr>
+          <w:rFonts w:ascii="Meiryo UI" w:hAnsi="Meiryo UI"/>
+          <w:sz w:val="21"/>
+        </w:rPr>
+        <w:t xml:space="preserve">サウルが答えを得られなかったその方に、皆さんは求めてよいのです。</w:t>
+      </w:r>
+    </w:p>
+    <w:p>
+      <w:pPr>
+        <w:pStyle w:val="a8"/>
+        <w:rPr>
+          <w:rFonts w:ascii="Meiryo UI" w:hAnsi="Meiryo UI"/>
+          <w:sz w:val="21"/>
+        </w:rPr>
+      </w:pPr>
+      <w:r>
+        <w:rPr>
+          <w:rFonts w:ascii="Meiryo UI" w:hAnsi="Meiryo UI"/>
+          <w:sz w:val="21"/>
+        </w:rPr>
+        <w:t xml:space="preserve">十四節で王位を受けたダビデの家から、イエス様が来てくださったからです。</w:t>
+      </w:r>
+    </w:p>
+    <w:p>
+      <w:pPr>
+        <w:pStyle w:val="a8"/>
+        <w:rPr>
+          <w:rFonts w:ascii="Meiryo UI" w:hAnsi="Meiryo UI"/>
+          <w:sz w:val="21"/>
+        </w:rPr>
+      </w:pPr>
+    </w:p>
+    <w:p>
+      <w:pPr>
+        <w:pStyle w:val="a8"/>
+        <w:rPr>
+          <w:rFonts w:ascii="Meiryo UI" w:hAnsi="Meiryo UI"/>
+          <w:sz w:val="21"/>
+        </w:rPr>
+      </w:pPr>
+      <w:r>
+        <w:rPr>
+          <w:rFonts w:ascii="Meiryo UI" w:hAnsi="Meiryo UI"/>
+          <w:sz w:val="21"/>
+        </w:rPr>
+        <w:t xml:space="preserve">歴代誌は、サウルの家の名前を一つも省かずに残しました。</w:t>
+      </w:r>
+    </w:p>
+    <w:p>
+      <w:pPr>
+        <w:pStyle w:val="a8"/>
+        <w:rPr>
+          <w:rFonts w:ascii="Meiryo UI" w:hAnsi="Meiryo UI"/>
+          <w:sz w:val="21"/>
+        </w:rPr>
+      </w:pPr>
+      <w:r>
+        <w:rPr>
+          <w:rFonts w:ascii="Meiryo UI" w:hAnsi="Meiryo UI"/>
+          <w:sz w:val="21"/>
+        </w:rPr>
+        <w:t xml:space="preserve">けれども、その名簿の最後に書かれたのは、尋ねたかどうかでした。</w:t>
+      </w:r>
+    </w:p>
+    <w:p>
+      <w:pPr>
+        <w:pStyle w:val="a8"/>
+        <w:rPr>
+          <w:rFonts w:ascii="Meiryo UI" w:hAnsi="Meiryo UI"/>
+          <w:sz w:val="21"/>
+        </w:rPr>
+      </w:pPr>
+      <w:r>
+        <w:rPr>
+          <w:rFonts w:ascii="Meiryo UI" w:hAnsi="Meiryo UI"/>
+          <w:sz w:val="21"/>
+        </w:rPr>
+        <w:t xml:space="preserve">今日一日を、まず主に尋ねてから出て行く一日にしていただきたいと思います。</w:t>
+      </w:r>
+    </w:p>
+    <w:p>
+      <w:pPr>
+        <w:pStyle w:val="a8"/>
+        <w:rPr>
+          <w:rFonts w:ascii="Meiryo UI" w:hAnsi="Meiryo UI"/>
+          <w:sz w:val="21"/>
+        </w:rPr>
+      </w:pPr>
     </w:p>
     <w:p>
       <w:pPr>

</xml_diff>